<commit_message>
RSR: regen DOCX template matching HTML preview styles
- Section titles: navy bold with 2pt bottom border (#1f4e79)
- Label cells: #f5f5f5 gray background, bold text
- Image label bars: #e0e0e0 gray, centered caps
- Notes box: #f9f9f9 background with border
- All borders: 1px solid #ccc matching rsr-table CSS

https://claude.ai/code/session_01Nc3L33RdvZTDhVy6BGkTVT
</commit_message>
<xml_diff>
--- a/templates/RSR_TEMPLATE.docx
+++ b/templates/RSR_TEMPLATE.docx
@@ -4,7 +4,6 @@
   <w:body>
     <w:tbl>
       <w:tblPr>
-        <w:tblStyle w:val="TableGrid"/>
         <w:tblW w:type="auto" w:w="0"/>
         <w:tblLook w:firstColumn="1" w:firstRow="1" w:lastColumn="0" w:lastRow="0" w:noHBand="0" w:noVBand="1" w:val="04A0"/>
       </w:tblPr>
@@ -15,32 +14,33 @@
         <w:tc>
           <w:tcPr>
             <w:tcW w:type="dxa" w:w="9638"/>
-            <w:shd w:val="clear" w:color="auto" w:fill="1B4F8E"/>
+            <w:shd w:val="clear" w:color="auto" w:fill="1F4E79"/>
           </w:tcPr>
           <w:p>
             <w:pPr>
-              <w:spacing w:before="120" w:after="40"/>
-              <w:jc w:val="left"/>
+              <w:spacing w:before="160" w:after="40"/>
+              <w:ind w:left="170"/>
             </w:pPr>
             <w:r>
               <w:rPr>
                 <w:rFonts w:ascii="Arial" w:hAnsi="Arial"/>
                 <w:b/>
                 <w:color w:val="FFFFFF"/>
-                <w:sz w:val="26"/>
+                <w:sz w:val="28"/>
               </w:rPr>
               <w:t>TEMPORARY ROAD CLOSURES</w:t>
             </w:r>
           </w:p>
           <w:p>
             <w:pPr>
-              <w:spacing w:before="0" w:after="120"/>
+              <w:spacing w:before="0" w:after="160"/>
+              <w:ind w:left="170"/>
             </w:pPr>
             <w:r>
               <w:rPr>
                 <w:rFonts w:ascii="Arial" w:hAnsi="Arial"/>
-                <w:color w:val="C8DCFF"/>
-                <w:sz w:val="18"/>
+                <w:color w:val="B4D2F5"/>
+                <w:sz w:val="19"/>
               </w:rPr>
               <w:t>Information Sheet — to be submitted to Network Management</w:t>
             </w:r>
@@ -48,16 +48,23 @@
         </w:tc>
       </w:tr>
     </w:tbl>
-    <w:p/>
     <w:p>
       <w:pPr>
-        <w:spacing w:after="60"/>
+        <w:spacing w:before="0" w:after="120"/>
+      </w:pPr>
+    </w:p>
+    <w:p>
+      <w:pPr>
+        <w:spacing w:before="200" w:after="80"/>
+        <w:pBdr>
+          <w:bottom w:val="single" w:sz="12" w:space="1" w:color="1f4e79"/>
+        </w:pBdr>
       </w:pPr>
       <w:r>
         <w:rPr>
           <w:rFonts w:ascii="Arial" w:hAnsi="Arial"/>
           <w:b/>
-          <w:color w:val="1A4F8E"/>
+          <w:color w:val="1F4E79"/>
           <w:sz w:val="20"/>
         </w:rPr>
         <w:t>1. Applicant Details</w:t>
@@ -70,21 +77,25 @@
         <w:tblLook w:firstColumn="1" w:firstRow="1" w:lastColumn="0" w:lastRow="0" w:noHBand="0" w:noVBand="1" w:val="04A0"/>
       </w:tblPr>
       <w:tblGrid>
-        <w:gridCol w:w="3402"/>
-        <w:gridCol w:w="6236"/>
+        <w:gridCol w:w="4819"/>
+        <w:gridCol w:w="4819"/>
       </w:tblGrid>
       <w:tr>
         <w:tc>
           <w:tcPr>
-            <w:tcW w:type="dxa" w:w="4819"/>
+            <w:tcW w:type="dxa" w:w="3288"/>
+            <w:shd w:val="clear" w:color="auto" w:fill="F5F5F5"/>
             <w:tcBorders>
-              <w:top w:val="single" w:sz="4" w:space="0" w:color="AAAAAA"/>
-              <w:left w:val="single" w:sz="4" w:space="0" w:color="AAAAAA"/>
-              <w:bottom w:val="single" w:sz="4" w:space="0" w:color="AAAAAA"/>
-              <w:right w:val="single" w:sz="4" w:space="0" w:color="AAAAAA"/>
+              <w:top w:val="single" w:sz="4" w:space="0" w:color="CCCCCC"/>
+              <w:left w:val="single" w:sz="4" w:space="0" w:color="CCCCCC"/>
+              <w:bottom w:val="single" w:sz="4" w:space="0" w:color="CCCCCC"/>
+              <w:right w:val="single" w:sz="4" w:space="0" w:color="CCCCCC"/>
             </w:tcBorders>
           </w:tcPr>
           <w:p>
+            <w:pPr>
+              <w:spacing w:before="60" w:after="60"/>
+            </w:pPr>
             <w:r>
               <w:rPr>
                 <w:rFonts w:ascii="Arial" w:hAnsi="Arial"/>
@@ -97,15 +108,18 @@
         </w:tc>
         <w:tc>
           <w:tcPr>
-            <w:tcW w:type="dxa" w:w="4819"/>
+            <w:tcW w:type="dxa" w:w="6350"/>
             <w:tcBorders>
-              <w:top w:val="single" w:sz="4" w:space="0" w:color="AAAAAA"/>
-              <w:left w:val="single" w:sz="4" w:space="0" w:color="AAAAAA"/>
-              <w:bottom w:val="single" w:sz="4" w:space="0" w:color="AAAAAA"/>
-              <w:right w:val="single" w:sz="4" w:space="0" w:color="AAAAAA"/>
+              <w:top w:val="single" w:sz="4" w:space="0" w:color="CCCCCC"/>
+              <w:left w:val="single" w:sz="4" w:space="0" w:color="CCCCCC"/>
+              <w:bottom w:val="single" w:sz="4" w:space="0" w:color="CCCCCC"/>
+              <w:right w:val="single" w:sz="4" w:space="0" w:color="CCCCCC"/>
             </w:tcBorders>
           </w:tcPr>
           <w:p>
+            <w:pPr>
+              <w:spacing w:before="60" w:after="60"/>
+            </w:pPr>
             <w:r>
               <w:rPr>
                 <w:rFonts w:ascii="Arial" w:hAnsi="Arial"/>
@@ -119,15 +133,19 @@
       <w:tr>
         <w:tc>
           <w:tcPr>
-            <w:tcW w:type="dxa" w:w="4819"/>
+            <w:tcW w:type="dxa" w:w="3288"/>
+            <w:shd w:val="clear" w:color="auto" w:fill="F5F5F5"/>
             <w:tcBorders>
-              <w:top w:val="single" w:sz="4" w:space="0" w:color="AAAAAA"/>
-              <w:left w:val="single" w:sz="4" w:space="0" w:color="AAAAAA"/>
-              <w:bottom w:val="single" w:sz="4" w:space="0" w:color="AAAAAA"/>
-              <w:right w:val="single" w:sz="4" w:space="0" w:color="AAAAAA"/>
+              <w:top w:val="single" w:sz="4" w:space="0" w:color="CCCCCC"/>
+              <w:left w:val="single" w:sz="4" w:space="0" w:color="CCCCCC"/>
+              <w:bottom w:val="single" w:sz="4" w:space="0" w:color="CCCCCC"/>
+              <w:right w:val="single" w:sz="4" w:space="0" w:color="CCCCCC"/>
             </w:tcBorders>
           </w:tcPr>
           <w:p>
+            <w:pPr>
+              <w:spacing w:before="60" w:after="60"/>
+            </w:pPr>
             <w:r>
               <w:rPr>
                 <w:rFonts w:ascii="Arial" w:hAnsi="Arial"/>
@@ -140,15 +158,18 @@
         </w:tc>
         <w:tc>
           <w:tcPr>
-            <w:tcW w:type="dxa" w:w="4819"/>
+            <w:tcW w:type="dxa" w:w="6350"/>
             <w:tcBorders>
-              <w:top w:val="single" w:sz="4" w:space="0" w:color="AAAAAA"/>
-              <w:left w:val="single" w:sz="4" w:space="0" w:color="AAAAAA"/>
-              <w:bottom w:val="single" w:sz="4" w:space="0" w:color="AAAAAA"/>
-              <w:right w:val="single" w:sz="4" w:space="0" w:color="AAAAAA"/>
+              <w:top w:val="single" w:sz="4" w:space="0" w:color="CCCCCC"/>
+              <w:left w:val="single" w:sz="4" w:space="0" w:color="CCCCCC"/>
+              <w:bottom w:val="single" w:sz="4" w:space="0" w:color="CCCCCC"/>
+              <w:right w:val="single" w:sz="4" w:space="0" w:color="CCCCCC"/>
             </w:tcBorders>
           </w:tcPr>
           <w:p>
+            <w:pPr>
+              <w:spacing w:before="60" w:after="60"/>
+            </w:pPr>
             <w:r>
               <w:rPr>
                 <w:rFonts w:ascii="Arial" w:hAnsi="Arial"/>
@@ -162,15 +183,19 @@
       <w:tr>
         <w:tc>
           <w:tcPr>
-            <w:tcW w:type="dxa" w:w="4819"/>
+            <w:tcW w:type="dxa" w:w="3288"/>
+            <w:shd w:val="clear" w:color="auto" w:fill="F5F5F5"/>
             <w:tcBorders>
-              <w:top w:val="single" w:sz="4" w:space="0" w:color="AAAAAA"/>
-              <w:left w:val="single" w:sz="4" w:space="0" w:color="AAAAAA"/>
-              <w:bottom w:val="single" w:sz="4" w:space="0" w:color="AAAAAA"/>
-              <w:right w:val="single" w:sz="4" w:space="0" w:color="AAAAAA"/>
+              <w:top w:val="single" w:sz="4" w:space="0" w:color="CCCCCC"/>
+              <w:left w:val="single" w:sz="4" w:space="0" w:color="CCCCCC"/>
+              <w:bottom w:val="single" w:sz="4" w:space="0" w:color="CCCCCC"/>
+              <w:right w:val="single" w:sz="4" w:space="0" w:color="CCCCCC"/>
             </w:tcBorders>
           </w:tcPr>
           <w:p>
+            <w:pPr>
+              <w:spacing w:before="60" w:after="60"/>
+            </w:pPr>
             <w:r>
               <w:rPr>
                 <w:rFonts w:ascii="Arial" w:hAnsi="Arial"/>
@@ -183,15 +208,18 @@
         </w:tc>
         <w:tc>
           <w:tcPr>
-            <w:tcW w:type="dxa" w:w="4819"/>
+            <w:tcW w:type="dxa" w:w="6350"/>
             <w:tcBorders>
-              <w:top w:val="single" w:sz="4" w:space="0" w:color="AAAAAA"/>
-              <w:left w:val="single" w:sz="4" w:space="0" w:color="AAAAAA"/>
-              <w:bottom w:val="single" w:sz="4" w:space="0" w:color="AAAAAA"/>
-              <w:right w:val="single" w:sz="4" w:space="0" w:color="AAAAAA"/>
+              <w:top w:val="single" w:sz="4" w:space="0" w:color="CCCCCC"/>
+              <w:left w:val="single" w:sz="4" w:space="0" w:color="CCCCCC"/>
+              <w:bottom w:val="single" w:sz="4" w:space="0" w:color="CCCCCC"/>
+              <w:right w:val="single" w:sz="4" w:space="0" w:color="CCCCCC"/>
             </w:tcBorders>
           </w:tcPr>
           <w:p>
+            <w:pPr>
+              <w:spacing w:before="60" w:after="60"/>
+            </w:pPr>
             <w:r>
               <w:rPr>
                 <w:rFonts w:ascii="Arial" w:hAnsi="Arial"/>
@@ -205,15 +233,19 @@
       <w:tr>
         <w:tc>
           <w:tcPr>
-            <w:tcW w:type="dxa" w:w="4819"/>
+            <w:tcW w:type="dxa" w:w="3288"/>
+            <w:shd w:val="clear" w:color="auto" w:fill="F5F5F5"/>
             <w:tcBorders>
-              <w:top w:val="single" w:sz="4" w:space="0" w:color="AAAAAA"/>
-              <w:left w:val="single" w:sz="4" w:space="0" w:color="AAAAAA"/>
-              <w:bottom w:val="single" w:sz="4" w:space="0" w:color="AAAAAA"/>
-              <w:right w:val="single" w:sz="4" w:space="0" w:color="AAAAAA"/>
+              <w:top w:val="single" w:sz="4" w:space="0" w:color="CCCCCC"/>
+              <w:left w:val="single" w:sz="4" w:space="0" w:color="CCCCCC"/>
+              <w:bottom w:val="single" w:sz="4" w:space="0" w:color="CCCCCC"/>
+              <w:right w:val="single" w:sz="4" w:space="0" w:color="CCCCCC"/>
             </w:tcBorders>
           </w:tcPr>
           <w:p>
+            <w:pPr>
+              <w:spacing w:before="60" w:after="60"/>
+            </w:pPr>
             <w:r>
               <w:rPr>
                 <w:rFonts w:ascii="Arial" w:hAnsi="Arial"/>
@@ -226,15 +258,18 @@
         </w:tc>
         <w:tc>
           <w:tcPr>
-            <w:tcW w:type="dxa" w:w="4819"/>
+            <w:tcW w:type="dxa" w:w="6350"/>
             <w:tcBorders>
-              <w:top w:val="single" w:sz="4" w:space="0" w:color="AAAAAA"/>
-              <w:left w:val="single" w:sz="4" w:space="0" w:color="AAAAAA"/>
-              <w:bottom w:val="single" w:sz="4" w:space="0" w:color="AAAAAA"/>
-              <w:right w:val="single" w:sz="4" w:space="0" w:color="AAAAAA"/>
+              <w:top w:val="single" w:sz="4" w:space="0" w:color="CCCCCC"/>
+              <w:left w:val="single" w:sz="4" w:space="0" w:color="CCCCCC"/>
+              <w:bottom w:val="single" w:sz="4" w:space="0" w:color="CCCCCC"/>
+              <w:right w:val="single" w:sz="4" w:space="0" w:color="CCCCCC"/>
             </w:tcBorders>
           </w:tcPr>
           <w:p>
+            <w:pPr>
+              <w:spacing w:before="60" w:after="60"/>
+            </w:pPr>
             <w:r>
               <w:rPr>
                 <w:rFonts w:ascii="Arial" w:hAnsi="Arial"/>
@@ -248,15 +283,19 @@
       <w:tr>
         <w:tc>
           <w:tcPr>
-            <w:tcW w:type="dxa" w:w="4819"/>
+            <w:tcW w:type="dxa" w:w="3288"/>
+            <w:shd w:val="clear" w:color="auto" w:fill="F5F5F5"/>
             <w:tcBorders>
-              <w:top w:val="single" w:sz="4" w:space="0" w:color="AAAAAA"/>
-              <w:left w:val="single" w:sz="4" w:space="0" w:color="AAAAAA"/>
-              <w:bottom w:val="single" w:sz="4" w:space="0" w:color="AAAAAA"/>
-              <w:right w:val="single" w:sz="4" w:space="0" w:color="AAAAAA"/>
+              <w:top w:val="single" w:sz="4" w:space="0" w:color="CCCCCC"/>
+              <w:left w:val="single" w:sz="4" w:space="0" w:color="CCCCCC"/>
+              <w:bottom w:val="single" w:sz="4" w:space="0" w:color="CCCCCC"/>
+              <w:right w:val="single" w:sz="4" w:space="0" w:color="CCCCCC"/>
             </w:tcBorders>
           </w:tcPr>
           <w:p>
+            <w:pPr>
+              <w:spacing w:before="60" w:after="60"/>
+            </w:pPr>
             <w:r>
               <w:rPr>
                 <w:rFonts w:ascii="Arial" w:hAnsi="Arial"/>
@@ -269,15 +308,18 @@
         </w:tc>
         <w:tc>
           <w:tcPr>
-            <w:tcW w:type="dxa" w:w="4819"/>
+            <w:tcW w:type="dxa" w:w="6350"/>
             <w:tcBorders>
-              <w:top w:val="single" w:sz="4" w:space="0" w:color="AAAAAA"/>
-              <w:left w:val="single" w:sz="4" w:space="0" w:color="AAAAAA"/>
-              <w:bottom w:val="single" w:sz="4" w:space="0" w:color="AAAAAA"/>
-              <w:right w:val="single" w:sz="4" w:space="0" w:color="AAAAAA"/>
+              <w:top w:val="single" w:sz="4" w:space="0" w:color="CCCCCC"/>
+              <w:left w:val="single" w:sz="4" w:space="0" w:color="CCCCCC"/>
+              <w:bottom w:val="single" w:sz="4" w:space="0" w:color="CCCCCC"/>
+              <w:right w:val="single" w:sz="4" w:space="0" w:color="CCCCCC"/>
             </w:tcBorders>
           </w:tcPr>
           <w:p>
+            <w:pPr>
+              <w:spacing w:before="60" w:after="60"/>
+            </w:pPr>
             <w:r>
               <w:rPr>
                 <w:rFonts w:ascii="Arial" w:hAnsi="Arial"/>
@@ -288,11 +330,12 @@
           </w:p>
           <w:p>
             <w:pPr>
-              <w:spacing w:before="0"/>
+              <w:spacing w:before="0" w:after="60"/>
             </w:pPr>
             <w:r>
               <w:rPr>
                 <w:rFonts w:ascii="Arial" w:hAnsi="Arial"/>
+                <w:sz w:val="18"/>
               </w:rPr>
               <w:t>Contracts House, 1 Soutar Street, Dundee DD3 8SS</w:t>
             </w:r>
@@ -302,15 +345,19 @@
       <w:tr>
         <w:tc>
           <w:tcPr>
-            <w:tcW w:type="dxa" w:w="4819"/>
+            <w:tcW w:type="dxa" w:w="3288"/>
+            <w:shd w:val="clear" w:color="auto" w:fill="F5F5F5"/>
             <w:tcBorders>
-              <w:top w:val="single" w:sz="4" w:space="0" w:color="AAAAAA"/>
-              <w:left w:val="single" w:sz="4" w:space="0" w:color="AAAAAA"/>
-              <w:bottom w:val="single" w:sz="4" w:space="0" w:color="AAAAAA"/>
-              <w:right w:val="single" w:sz="4" w:space="0" w:color="AAAAAA"/>
+              <w:top w:val="single" w:sz="4" w:space="0" w:color="CCCCCC"/>
+              <w:left w:val="single" w:sz="4" w:space="0" w:color="CCCCCC"/>
+              <w:bottom w:val="single" w:sz="4" w:space="0" w:color="CCCCCC"/>
+              <w:right w:val="single" w:sz="4" w:space="0" w:color="CCCCCC"/>
             </w:tcBorders>
           </w:tcPr>
           <w:p>
+            <w:pPr>
+              <w:spacing w:before="60" w:after="60"/>
+            </w:pPr>
             <w:r>
               <w:rPr>
                 <w:rFonts w:ascii="Arial" w:hAnsi="Arial"/>
@@ -323,15 +370,18 @@
         </w:tc>
         <w:tc>
           <w:tcPr>
-            <w:tcW w:type="dxa" w:w="4819"/>
+            <w:tcW w:type="dxa" w:w="6350"/>
             <w:tcBorders>
-              <w:top w:val="single" w:sz="4" w:space="0" w:color="AAAAAA"/>
-              <w:left w:val="single" w:sz="4" w:space="0" w:color="AAAAAA"/>
-              <w:bottom w:val="single" w:sz="4" w:space="0" w:color="AAAAAA"/>
-              <w:right w:val="single" w:sz="4" w:space="0" w:color="AAAAAA"/>
+              <w:top w:val="single" w:sz="4" w:space="0" w:color="CCCCCC"/>
+              <w:left w:val="single" w:sz="4" w:space="0" w:color="CCCCCC"/>
+              <w:bottom w:val="single" w:sz="4" w:space="0" w:color="CCCCCC"/>
+              <w:right w:val="single" w:sz="4" w:space="0" w:color="CCCCCC"/>
             </w:tcBorders>
           </w:tcPr>
           <w:p>
+            <w:pPr>
+              <w:spacing w:before="60" w:after="60"/>
+            </w:pPr>
             <w:r>
               <w:rPr>
                 <w:rFonts w:ascii="Arial" w:hAnsi="Arial"/>
@@ -345,15 +395,19 @@
       <w:tr>
         <w:tc>
           <w:tcPr>
-            <w:tcW w:type="dxa" w:w="4819"/>
+            <w:tcW w:type="dxa" w:w="3288"/>
+            <w:shd w:val="clear" w:color="auto" w:fill="F5F5F5"/>
             <w:tcBorders>
-              <w:top w:val="single" w:sz="4" w:space="0" w:color="AAAAAA"/>
-              <w:left w:val="single" w:sz="4" w:space="0" w:color="AAAAAA"/>
-              <w:bottom w:val="single" w:sz="4" w:space="0" w:color="AAAAAA"/>
-              <w:right w:val="single" w:sz="4" w:space="0" w:color="AAAAAA"/>
+              <w:top w:val="single" w:sz="4" w:space="0" w:color="CCCCCC"/>
+              <w:left w:val="single" w:sz="4" w:space="0" w:color="CCCCCC"/>
+              <w:bottom w:val="single" w:sz="4" w:space="0" w:color="CCCCCC"/>
+              <w:right w:val="single" w:sz="4" w:space="0" w:color="CCCCCC"/>
             </w:tcBorders>
           </w:tcPr>
           <w:p>
+            <w:pPr>
+              <w:spacing w:before="60" w:after="60"/>
+            </w:pPr>
             <w:r>
               <w:rPr>
                 <w:rFonts w:ascii="Arial" w:hAnsi="Arial"/>
@@ -366,15 +420,18 @@
         </w:tc>
         <w:tc>
           <w:tcPr>
-            <w:tcW w:type="dxa" w:w="4819"/>
+            <w:tcW w:type="dxa" w:w="6350"/>
             <w:tcBorders>
-              <w:top w:val="single" w:sz="4" w:space="0" w:color="AAAAAA"/>
-              <w:left w:val="single" w:sz="4" w:space="0" w:color="AAAAAA"/>
-              <w:bottom w:val="single" w:sz="4" w:space="0" w:color="AAAAAA"/>
-              <w:right w:val="single" w:sz="4" w:space="0" w:color="AAAAAA"/>
+              <w:top w:val="single" w:sz="4" w:space="0" w:color="CCCCCC"/>
+              <w:left w:val="single" w:sz="4" w:space="0" w:color="CCCCCC"/>
+              <w:bottom w:val="single" w:sz="4" w:space="0" w:color="CCCCCC"/>
+              <w:right w:val="single" w:sz="4" w:space="0" w:color="CCCCCC"/>
             </w:tcBorders>
           </w:tcPr>
           <w:p>
+            <w:pPr>
+              <w:spacing w:before="60" w:after="60"/>
+            </w:pPr>
             <w:r>
               <w:rPr>
                 <w:rFonts w:ascii="Arial" w:hAnsi="Arial"/>
@@ -386,16 +443,18 @@
         </w:tc>
       </w:tr>
     </w:tbl>
-    <w:p/>
     <w:p>
       <w:pPr>
-        <w:spacing w:after="60"/>
+        <w:spacing w:before="200" w:after="80"/>
+        <w:pBdr>
+          <w:bottom w:val="single" w:sz="12" w:space="1" w:color="1f4e79"/>
+        </w:pBdr>
       </w:pPr>
       <w:r>
         <w:rPr>
           <w:rFonts w:ascii="Arial" w:hAnsi="Arial"/>
           <w:b/>
-          <w:color w:val="1A4F8E"/>
+          <w:color w:val="1F4E79"/>
           <w:sz w:val="20"/>
         </w:rPr>
         <w:t>2. Closure Details</w:t>
@@ -408,21 +467,25 @@
         <w:tblLook w:firstColumn="1" w:firstRow="1" w:lastColumn="0" w:lastRow="0" w:noHBand="0" w:noVBand="1" w:val="04A0"/>
       </w:tblPr>
       <w:tblGrid>
-        <w:gridCol w:w="3402"/>
-        <w:gridCol w:w="6236"/>
+        <w:gridCol w:w="4819"/>
+        <w:gridCol w:w="4819"/>
       </w:tblGrid>
       <w:tr>
         <w:tc>
           <w:tcPr>
-            <w:tcW w:type="dxa" w:w="4819"/>
+            <w:tcW w:type="dxa" w:w="3288"/>
+            <w:shd w:val="clear" w:color="auto" w:fill="F5F5F5"/>
             <w:tcBorders>
-              <w:top w:val="single" w:sz="4" w:space="0" w:color="AAAAAA"/>
-              <w:left w:val="single" w:sz="4" w:space="0" w:color="AAAAAA"/>
-              <w:bottom w:val="single" w:sz="4" w:space="0" w:color="AAAAAA"/>
-              <w:right w:val="single" w:sz="4" w:space="0" w:color="AAAAAA"/>
+              <w:top w:val="single" w:sz="4" w:space="0" w:color="CCCCCC"/>
+              <w:left w:val="single" w:sz="4" w:space="0" w:color="CCCCCC"/>
+              <w:bottom w:val="single" w:sz="4" w:space="0" w:color="CCCCCC"/>
+              <w:right w:val="single" w:sz="4" w:space="0" w:color="CCCCCC"/>
             </w:tcBorders>
           </w:tcPr>
           <w:p>
+            <w:pPr>
+              <w:spacing w:before="60" w:after="60"/>
+            </w:pPr>
             <w:r>
               <w:rPr>
                 <w:rFonts w:ascii="Arial" w:hAnsi="Arial"/>
@@ -435,15 +498,18 @@
         </w:tc>
         <w:tc>
           <w:tcPr>
-            <w:tcW w:type="dxa" w:w="4819"/>
+            <w:tcW w:type="dxa" w:w="6350"/>
             <w:tcBorders>
-              <w:top w:val="single" w:sz="4" w:space="0" w:color="AAAAAA"/>
-              <w:left w:val="single" w:sz="4" w:space="0" w:color="AAAAAA"/>
-              <w:bottom w:val="single" w:sz="4" w:space="0" w:color="AAAAAA"/>
-              <w:right w:val="single" w:sz="4" w:space="0" w:color="AAAAAA"/>
+              <w:top w:val="single" w:sz="4" w:space="0" w:color="CCCCCC"/>
+              <w:left w:val="single" w:sz="4" w:space="0" w:color="CCCCCC"/>
+              <w:bottom w:val="single" w:sz="4" w:space="0" w:color="CCCCCC"/>
+              <w:right w:val="single" w:sz="4" w:space="0" w:color="CCCCCC"/>
             </w:tcBorders>
           </w:tcPr>
           <w:p>
+            <w:pPr>
+              <w:spacing w:before="60" w:after="60"/>
+            </w:pPr>
             <w:r>
               <w:rPr>
                 <w:rFonts w:ascii="Arial" w:hAnsi="Arial"/>
@@ -457,15 +523,19 @@
       <w:tr>
         <w:tc>
           <w:tcPr>
-            <w:tcW w:type="dxa" w:w="4819"/>
+            <w:tcW w:type="dxa" w:w="3288"/>
+            <w:shd w:val="clear" w:color="auto" w:fill="F5F5F5"/>
             <w:tcBorders>
-              <w:top w:val="single" w:sz="4" w:space="0" w:color="AAAAAA"/>
-              <w:left w:val="single" w:sz="4" w:space="0" w:color="AAAAAA"/>
-              <w:bottom w:val="single" w:sz="4" w:space="0" w:color="AAAAAA"/>
-              <w:right w:val="single" w:sz="4" w:space="0" w:color="AAAAAA"/>
+              <w:top w:val="single" w:sz="4" w:space="0" w:color="CCCCCC"/>
+              <w:left w:val="single" w:sz="4" w:space="0" w:color="CCCCCC"/>
+              <w:bottom w:val="single" w:sz="4" w:space="0" w:color="CCCCCC"/>
+              <w:right w:val="single" w:sz="4" w:space="0" w:color="CCCCCC"/>
             </w:tcBorders>
           </w:tcPr>
           <w:p>
+            <w:pPr>
+              <w:spacing w:before="60" w:after="60"/>
+            </w:pPr>
             <w:r>
               <w:rPr>
                 <w:rFonts w:ascii="Arial" w:hAnsi="Arial"/>
@@ -478,15 +548,18 @@
         </w:tc>
         <w:tc>
           <w:tcPr>
-            <w:tcW w:type="dxa" w:w="4819"/>
+            <w:tcW w:type="dxa" w:w="6350"/>
             <w:tcBorders>
-              <w:top w:val="single" w:sz="4" w:space="0" w:color="AAAAAA"/>
-              <w:left w:val="single" w:sz="4" w:space="0" w:color="AAAAAA"/>
-              <w:bottom w:val="single" w:sz="4" w:space="0" w:color="AAAAAA"/>
-              <w:right w:val="single" w:sz="4" w:space="0" w:color="AAAAAA"/>
+              <w:top w:val="single" w:sz="4" w:space="0" w:color="CCCCCC"/>
+              <w:left w:val="single" w:sz="4" w:space="0" w:color="CCCCCC"/>
+              <w:bottom w:val="single" w:sz="4" w:space="0" w:color="CCCCCC"/>
+              <w:right w:val="single" w:sz="4" w:space="0" w:color="CCCCCC"/>
             </w:tcBorders>
           </w:tcPr>
           <w:p>
+            <w:pPr>
+              <w:spacing w:before="60" w:after="60"/>
+            </w:pPr>
             <w:r>
               <w:rPr>
                 <w:rFonts w:ascii="Arial" w:hAnsi="Arial"/>
@@ -500,15 +573,19 @@
       <w:tr>
         <w:tc>
           <w:tcPr>
-            <w:tcW w:type="dxa" w:w="4819"/>
+            <w:tcW w:type="dxa" w:w="3288"/>
+            <w:shd w:val="clear" w:color="auto" w:fill="F5F5F5"/>
             <w:tcBorders>
-              <w:top w:val="single" w:sz="4" w:space="0" w:color="AAAAAA"/>
-              <w:left w:val="single" w:sz="4" w:space="0" w:color="AAAAAA"/>
-              <w:bottom w:val="single" w:sz="4" w:space="0" w:color="AAAAAA"/>
-              <w:right w:val="single" w:sz="4" w:space="0" w:color="AAAAAA"/>
+              <w:top w:val="single" w:sz="4" w:space="0" w:color="CCCCCC"/>
+              <w:left w:val="single" w:sz="4" w:space="0" w:color="CCCCCC"/>
+              <w:bottom w:val="single" w:sz="4" w:space="0" w:color="CCCCCC"/>
+              <w:right w:val="single" w:sz="4" w:space="0" w:color="CCCCCC"/>
             </w:tcBorders>
           </w:tcPr>
           <w:p>
+            <w:pPr>
+              <w:spacing w:before="60" w:after="60"/>
+            </w:pPr>
             <w:r>
               <w:rPr>
                 <w:rFonts w:ascii="Arial" w:hAnsi="Arial"/>
@@ -521,15 +598,18 @@
         </w:tc>
         <w:tc>
           <w:tcPr>
-            <w:tcW w:type="dxa" w:w="4819"/>
+            <w:tcW w:type="dxa" w:w="6350"/>
             <w:tcBorders>
-              <w:top w:val="single" w:sz="4" w:space="0" w:color="AAAAAA"/>
-              <w:left w:val="single" w:sz="4" w:space="0" w:color="AAAAAA"/>
-              <w:bottom w:val="single" w:sz="4" w:space="0" w:color="AAAAAA"/>
-              <w:right w:val="single" w:sz="4" w:space="0" w:color="AAAAAA"/>
+              <w:top w:val="single" w:sz="4" w:space="0" w:color="CCCCCC"/>
+              <w:left w:val="single" w:sz="4" w:space="0" w:color="CCCCCC"/>
+              <w:bottom w:val="single" w:sz="4" w:space="0" w:color="CCCCCC"/>
+              <w:right w:val="single" w:sz="4" w:space="0" w:color="CCCCCC"/>
             </w:tcBorders>
           </w:tcPr>
           <w:p>
+            <w:pPr>
+              <w:spacing w:before="60" w:after="60"/>
+            </w:pPr>
             <w:r>
               <w:rPr>
                 <w:rFonts w:ascii="Arial" w:hAnsi="Arial"/>
@@ -543,15 +623,19 @@
       <w:tr>
         <w:tc>
           <w:tcPr>
-            <w:tcW w:type="dxa" w:w="4819"/>
+            <w:tcW w:type="dxa" w:w="3288"/>
+            <w:shd w:val="clear" w:color="auto" w:fill="F5F5F5"/>
             <w:tcBorders>
-              <w:top w:val="single" w:sz="4" w:space="0" w:color="AAAAAA"/>
-              <w:left w:val="single" w:sz="4" w:space="0" w:color="AAAAAA"/>
-              <w:bottom w:val="single" w:sz="4" w:space="0" w:color="AAAAAA"/>
-              <w:right w:val="single" w:sz="4" w:space="0" w:color="AAAAAA"/>
+              <w:top w:val="single" w:sz="4" w:space="0" w:color="CCCCCC"/>
+              <w:left w:val="single" w:sz="4" w:space="0" w:color="CCCCCC"/>
+              <w:bottom w:val="single" w:sz="4" w:space="0" w:color="CCCCCC"/>
+              <w:right w:val="single" w:sz="4" w:space="0" w:color="CCCCCC"/>
             </w:tcBorders>
           </w:tcPr>
           <w:p>
+            <w:pPr>
+              <w:spacing w:before="60" w:after="60"/>
+            </w:pPr>
             <w:r>
               <w:rPr>
                 <w:rFonts w:ascii="Arial" w:hAnsi="Arial"/>
@@ -564,15 +648,18 @@
         </w:tc>
         <w:tc>
           <w:tcPr>
-            <w:tcW w:type="dxa" w:w="4819"/>
+            <w:tcW w:type="dxa" w:w="6350"/>
             <w:tcBorders>
-              <w:top w:val="single" w:sz="4" w:space="0" w:color="AAAAAA"/>
-              <w:left w:val="single" w:sz="4" w:space="0" w:color="AAAAAA"/>
-              <w:bottom w:val="single" w:sz="4" w:space="0" w:color="AAAAAA"/>
-              <w:right w:val="single" w:sz="4" w:space="0" w:color="AAAAAA"/>
+              <w:top w:val="single" w:sz="4" w:space="0" w:color="CCCCCC"/>
+              <w:left w:val="single" w:sz="4" w:space="0" w:color="CCCCCC"/>
+              <w:bottom w:val="single" w:sz="4" w:space="0" w:color="CCCCCC"/>
+              <w:right w:val="single" w:sz="4" w:space="0" w:color="CCCCCC"/>
             </w:tcBorders>
           </w:tcPr>
           <w:p>
+            <w:pPr>
+              <w:spacing w:before="60" w:after="60"/>
+            </w:pPr>
             <w:r>
               <w:rPr>
                 <w:rFonts w:ascii="Arial" w:hAnsi="Arial"/>
@@ -586,15 +673,19 @@
       <w:tr>
         <w:tc>
           <w:tcPr>
-            <w:tcW w:type="dxa" w:w="4819"/>
+            <w:tcW w:type="dxa" w:w="3288"/>
+            <w:shd w:val="clear" w:color="auto" w:fill="F5F5F5"/>
             <w:tcBorders>
-              <w:top w:val="single" w:sz="4" w:space="0" w:color="AAAAAA"/>
-              <w:left w:val="single" w:sz="4" w:space="0" w:color="AAAAAA"/>
-              <w:bottom w:val="single" w:sz="4" w:space="0" w:color="AAAAAA"/>
-              <w:right w:val="single" w:sz="4" w:space="0" w:color="AAAAAA"/>
+              <w:top w:val="single" w:sz="4" w:space="0" w:color="CCCCCC"/>
+              <w:left w:val="single" w:sz="4" w:space="0" w:color="CCCCCC"/>
+              <w:bottom w:val="single" w:sz="4" w:space="0" w:color="CCCCCC"/>
+              <w:right w:val="single" w:sz="4" w:space="0" w:color="CCCCCC"/>
             </w:tcBorders>
           </w:tcPr>
           <w:p>
+            <w:pPr>
+              <w:spacing w:before="60" w:after="60"/>
+            </w:pPr>
             <w:r>
               <w:rPr>
                 <w:rFonts w:ascii="Arial" w:hAnsi="Arial"/>
@@ -607,15 +698,18 @@
         </w:tc>
         <w:tc>
           <w:tcPr>
-            <w:tcW w:type="dxa" w:w="4819"/>
+            <w:tcW w:type="dxa" w:w="6350"/>
             <w:tcBorders>
-              <w:top w:val="single" w:sz="4" w:space="0" w:color="AAAAAA"/>
-              <w:left w:val="single" w:sz="4" w:space="0" w:color="AAAAAA"/>
-              <w:bottom w:val="single" w:sz="4" w:space="0" w:color="AAAAAA"/>
-              <w:right w:val="single" w:sz="4" w:space="0" w:color="AAAAAA"/>
+              <w:top w:val="single" w:sz="4" w:space="0" w:color="CCCCCC"/>
+              <w:left w:val="single" w:sz="4" w:space="0" w:color="CCCCCC"/>
+              <w:bottom w:val="single" w:sz="4" w:space="0" w:color="CCCCCC"/>
+              <w:right w:val="single" w:sz="4" w:space="0" w:color="CCCCCC"/>
             </w:tcBorders>
           </w:tcPr>
           <w:p>
+            <w:pPr>
+              <w:spacing w:before="60" w:after="60"/>
+            </w:pPr>
             <w:r>
               <w:rPr>
                 <w:rFonts w:ascii="Arial" w:hAnsi="Arial"/>
@@ -629,15 +723,19 @@
       <w:tr>
         <w:tc>
           <w:tcPr>
-            <w:tcW w:type="dxa" w:w="4819"/>
+            <w:tcW w:type="dxa" w:w="3288"/>
+            <w:shd w:val="clear" w:color="auto" w:fill="F5F5F5"/>
             <w:tcBorders>
-              <w:top w:val="single" w:sz="4" w:space="0" w:color="AAAAAA"/>
-              <w:left w:val="single" w:sz="4" w:space="0" w:color="AAAAAA"/>
-              <w:bottom w:val="single" w:sz="4" w:space="0" w:color="AAAAAA"/>
-              <w:right w:val="single" w:sz="4" w:space="0" w:color="AAAAAA"/>
+              <w:top w:val="single" w:sz="4" w:space="0" w:color="CCCCCC"/>
+              <w:left w:val="single" w:sz="4" w:space="0" w:color="CCCCCC"/>
+              <w:bottom w:val="single" w:sz="4" w:space="0" w:color="CCCCCC"/>
+              <w:right w:val="single" w:sz="4" w:space="0" w:color="CCCCCC"/>
             </w:tcBorders>
           </w:tcPr>
           <w:p>
+            <w:pPr>
+              <w:spacing w:before="60" w:after="60"/>
+            </w:pPr>
             <w:r>
               <w:rPr>
                 <w:rFonts w:ascii="Arial" w:hAnsi="Arial"/>
@@ -650,15 +748,18 @@
         </w:tc>
         <w:tc>
           <w:tcPr>
-            <w:tcW w:type="dxa" w:w="4819"/>
+            <w:tcW w:type="dxa" w:w="6350"/>
             <w:tcBorders>
-              <w:top w:val="single" w:sz="4" w:space="0" w:color="AAAAAA"/>
-              <w:left w:val="single" w:sz="4" w:space="0" w:color="AAAAAA"/>
-              <w:bottom w:val="single" w:sz="4" w:space="0" w:color="AAAAAA"/>
-              <w:right w:val="single" w:sz="4" w:space="0" w:color="AAAAAA"/>
+              <w:top w:val="single" w:sz="4" w:space="0" w:color="CCCCCC"/>
+              <w:left w:val="single" w:sz="4" w:space="0" w:color="CCCCCC"/>
+              <w:bottom w:val="single" w:sz="4" w:space="0" w:color="CCCCCC"/>
+              <w:right w:val="single" w:sz="4" w:space="0" w:color="CCCCCC"/>
             </w:tcBorders>
           </w:tcPr>
           <w:p>
+            <w:pPr>
+              <w:spacing w:before="60" w:after="60"/>
+            </w:pPr>
             <w:r>
               <w:rPr>
                 <w:rFonts w:ascii="Arial" w:hAnsi="Arial"/>
@@ -672,15 +773,19 @@
       <w:tr>
         <w:tc>
           <w:tcPr>
-            <w:tcW w:type="dxa" w:w="4819"/>
+            <w:tcW w:type="dxa" w:w="3288"/>
+            <w:shd w:val="clear" w:color="auto" w:fill="F5F5F5"/>
             <w:tcBorders>
-              <w:top w:val="single" w:sz="4" w:space="0" w:color="AAAAAA"/>
-              <w:left w:val="single" w:sz="4" w:space="0" w:color="AAAAAA"/>
-              <w:bottom w:val="single" w:sz="4" w:space="0" w:color="AAAAAA"/>
-              <w:right w:val="single" w:sz="4" w:space="0" w:color="AAAAAA"/>
+              <w:top w:val="single" w:sz="4" w:space="0" w:color="CCCCCC"/>
+              <w:left w:val="single" w:sz="4" w:space="0" w:color="CCCCCC"/>
+              <w:bottom w:val="single" w:sz="4" w:space="0" w:color="CCCCCC"/>
+              <w:right w:val="single" w:sz="4" w:space="0" w:color="CCCCCC"/>
             </w:tcBorders>
           </w:tcPr>
           <w:p>
+            <w:pPr>
+              <w:spacing w:before="60" w:after="60"/>
+            </w:pPr>
             <w:r>
               <w:rPr>
                 <w:rFonts w:ascii="Arial" w:hAnsi="Arial"/>
@@ -693,15 +798,18 @@
         </w:tc>
         <w:tc>
           <w:tcPr>
-            <w:tcW w:type="dxa" w:w="4819"/>
+            <w:tcW w:type="dxa" w:w="6350"/>
             <w:tcBorders>
-              <w:top w:val="single" w:sz="4" w:space="0" w:color="AAAAAA"/>
-              <w:left w:val="single" w:sz="4" w:space="0" w:color="AAAAAA"/>
-              <w:bottom w:val="single" w:sz="4" w:space="0" w:color="AAAAAA"/>
-              <w:right w:val="single" w:sz="4" w:space="0" w:color="AAAAAA"/>
+              <w:top w:val="single" w:sz="4" w:space="0" w:color="CCCCCC"/>
+              <w:left w:val="single" w:sz="4" w:space="0" w:color="CCCCCC"/>
+              <w:bottom w:val="single" w:sz="4" w:space="0" w:color="CCCCCC"/>
+              <w:right w:val="single" w:sz="4" w:space="0" w:color="CCCCCC"/>
             </w:tcBorders>
           </w:tcPr>
           <w:p>
+            <w:pPr>
+              <w:spacing w:before="60" w:after="60"/>
+            </w:pPr>
             <w:r>
               <w:rPr>
                 <w:rFonts w:ascii="Arial" w:hAnsi="Arial"/>
@@ -715,15 +823,19 @@
       <w:tr>
         <w:tc>
           <w:tcPr>
-            <w:tcW w:type="dxa" w:w="4819"/>
+            <w:tcW w:type="dxa" w:w="3288"/>
+            <w:shd w:val="clear" w:color="auto" w:fill="F5F5F5"/>
             <w:tcBorders>
-              <w:top w:val="single" w:sz="4" w:space="0" w:color="AAAAAA"/>
-              <w:left w:val="single" w:sz="4" w:space="0" w:color="AAAAAA"/>
-              <w:bottom w:val="single" w:sz="4" w:space="0" w:color="AAAAAA"/>
-              <w:right w:val="single" w:sz="4" w:space="0" w:color="AAAAAA"/>
+              <w:top w:val="single" w:sz="4" w:space="0" w:color="CCCCCC"/>
+              <w:left w:val="single" w:sz="4" w:space="0" w:color="CCCCCC"/>
+              <w:bottom w:val="single" w:sz="4" w:space="0" w:color="CCCCCC"/>
+              <w:right w:val="single" w:sz="4" w:space="0" w:color="CCCCCC"/>
             </w:tcBorders>
           </w:tcPr>
           <w:p>
+            <w:pPr>
+              <w:spacing w:before="60" w:after="60"/>
+            </w:pPr>
             <w:r>
               <w:rPr>
                 <w:rFonts w:ascii="Arial" w:hAnsi="Arial"/>
@@ -736,15 +848,18 @@
         </w:tc>
         <w:tc>
           <w:tcPr>
-            <w:tcW w:type="dxa" w:w="4819"/>
+            <w:tcW w:type="dxa" w:w="6350"/>
             <w:tcBorders>
-              <w:top w:val="single" w:sz="4" w:space="0" w:color="AAAAAA"/>
-              <w:left w:val="single" w:sz="4" w:space="0" w:color="AAAAAA"/>
-              <w:bottom w:val="single" w:sz="4" w:space="0" w:color="AAAAAA"/>
-              <w:right w:val="single" w:sz="4" w:space="0" w:color="AAAAAA"/>
+              <w:top w:val="single" w:sz="4" w:space="0" w:color="CCCCCC"/>
+              <w:left w:val="single" w:sz="4" w:space="0" w:color="CCCCCC"/>
+              <w:bottom w:val="single" w:sz="4" w:space="0" w:color="CCCCCC"/>
+              <w:right w:val="single" w:sz="4" w:space="0" w:color="CCCCCC"/>
             </w:tcBorders>
           </w:tcPr>
           <w:p>
+            <w:pPr>
+              <w:spacing w:before="60" w:after="60"/>
+            </w:pPr>
             <w:r>
               <w:rPr>
                 <w:rFonts w:ascii="Arial" w:hAnsi="Arial"/>
@@ -758,15 +873,19 @@
       <w:tr>
         <w:tc>
           <w:tcPr>
-            <w:tcW w:type="dxa" w:w="4819"/>
+            <w:tcW w:type="dxa" w:w="3288"/>
+            <w:shd w:val="clear" w:color="auto" w:fill="F5F5F5"/>
             <w:tcBorders>
-              <w:top w:val="single" w:sz="4" w:space="0" w:color="AAAAAA"/>
-              <w:left w:val="single" w:sz="4" w:space="0" w:color="AAAAAA"/>
-              <w:bottom w:val="single" w:sz="4" w:space="0" w:color="AAAAAA"/>
-              <w:right w:val="single" w:sz="4" w:space="0" w:color="AAAAAA"/>
+              <w:top w:val="single" w:sz="4" w:space="0" w:color="CCCCCC"/>
+              <w:left w:val="single" w:sz="4" w:space="0" w:color="CCCCCC"/>
+              <w:bottom w:val="single" w:sz="4" w:space="0" w:color="CCCCCC"/>
+              <w:right w:val="single" w:sz="4" w:space="0" w:color="CCCCCC"/>
             </w:tcBorders>
           </w:tcPr>
           <w:p>
+            <w:pPr>
+              <w:spacing w:before="60" w:after="60"/>
+            </w:pPr>
             <w:r>
               <w:rPr>
                 <w:rFonts w:ascii="Arial" w:hAnsi="Arial"/>
@@ -779,15 +898,18 @@
         </w:tc>
         <w:tc>
           <w:tcPr>
-            <w:tcW w:type="dxa" w:w="4819"/>
+            <w:tcW w:type="dxa" w:w="6350"/>
             <w:tcBorders>
-              <w:top w:val="single" w:sz="4" w:space="0" w:color="AAAAAA"/>
-              <w:left w:val="single" w:sz="4" w:space="0" w:color="AAAAAA"/>
-              <w:bottom w:val="single" w:sz="4" w:space="0" w:color="AAAAAA"/>
-              <w:right w:val="single" w:sz="4" w:space="0" w:color="AAAAAA"/>
+              <w:top w:val="single" w:sz="4" w:space="0" w:color="CCCCCC"/>
+              <w:left w:val="single" w:sz="4" w:space="0" w:color="CCCCCC"/>
+              <w:bottom w:val="single" w:sz="4" w:space="0" w:color="CCCCCC"/>
+              <w:right w:val="single" w:sz="4" w:space="0" w:color="CCCCCC"/>
             </w:tcBorders>
           </w:tcPr>
           <w:p>
+            <w:pPr>
+              <w:spacing w:before="60" w:after="60"/>
+            </w:pPr>
             <w:r>
               <w:rPr>
                 <w:rFonts w:ascii="Arial" w:hAnsi="Arial"/>
@@ -801,15 +923,19 @@
       <w:tr>
         <w:tc>
           <w:tcPr>
-            <w:tcW w:type="dxa" w:w="4819"/>
+            <w:tcW w:type="dxa" w:w="3288"/>
+            <w:shd w:val="clear" w:color="auto" w:fill="F5F5F5"/>
             <w:tcBorders>
-              <w:top w:val="single" w:sz="4" w:space="0" w:color="AAAAAA"/>
-              <w:left w:val="single" w:sz="4" w:space="0" w:color="AAAAAA"/>
-              <w:bottom w:val="single" w:sz="4" w:space="0" w:color="AAAAAA"/>
-              <w:right w:val="single" w:sz="4" w:space="0" w:color="AAAAAA"/>
+              <w:top w:val="single" w:sz="4" w:space="0" w:color="CCCCCC"/>
+              <w:left w:val="single" w:sz="4" w:space="0" w:color="CCCCCC"/>
+              <w:bottom w:val="single" w:sz="4" w:space="0" w:color="CCCCCC"/>
+              <w:right w:val="single" w:sz="4" w:space="0" w:color="CCCCCC"/>
             </w:tcBorders>
           </w:tcPr>
           <w:p>
+            <w:pPr>
+              <w:spacing w:before="60" w:after="60"/>
+            </w:pPr>
             <w:r>
               <w:rPr>
                 <w:rFonts w:ascii="Arial" w:hAnsi="Arial"/>
@@ -822,15 +948,18 @@
         </w:tc>
         <w:tc>
           <w:tcPr>
-            <w:tcW w:type="dxa" w:w="4819"/>
+            <w:tcW w:type="dxa" w:w="6350"/>
             <w:tcBorders>
-              <w:top w:val="single" w:sz="4" w:space="0" w:color="AAAAAA"/>
-              <w:left w:val="single" w:sz="4" w:space="0" w:color="AAAAAA"/>
-              <w:bottom w:val="single" w:sz="4" w:space="0" w:color="AAAAAA"/>
-              <w:right w:val="single" w:sz="4" w:space="0" w:color="AAAAAA"/>
+              <w:top w:val="single" w:sz="4" w:space="0" w:color="CCCCCC"/>
+              <w:left w:val="single" w:sz="4" w:space="0" w:color="CCCCCC"/>
+              <w:bottom w:val="single" w:sz="4" w:space="0" w:color="CCCCCC"/>
+              <w:right w:val="single" w:sz="4" w:space="0" w:color="CCCCCC"/>
             </w:tcBorders>
           </w:tcPr>
           <w:p>
+            <w:pPr>
+              <w:spacing w:before="60" w:after="60"/>
+            </w:pPr>
             <w:r>
               <w:rPr>
                 <w:rFonts w:ascii="Arial" w:hAnsi="Arial"/>
@@ -842,16 +971,18 @@
         </w:tc>
       </w:tr>
     </w:tbl>
-    <w:p/>
     <w:p>
       <w:pPr>
-        <w:spacing w:after="60"/>
+        <w:spacing w:before="200" w:after="80"/>
+        <w:pBdr>
+          <w:bottom w:val="single" w:sz="12" w:space="1" w:color="1f4e79"/>
+        </w:pBdr>
       </w:pPr>
       <w:r>
         <w:rPr>
           <w:rFonts w:ascii="Arial" w:hAnsi="Arial"/>
           <w:b/>
-          <w:color w:val="1A4F8E"/>
+          <w:color w:val="1F4E79"/>
           <w:sz w:val="20"/>
         </w:rPr>
         <w:t>3. Supporting Images</w:t>
@@ -871,14 +1002,19 @@
         <w:tc>
           <w:tcPr>
             <w:tcW w:type="dxa" w:w="4819"/>
+            <w:shd w:val="clear" w:color="auto" w:fill="E0E0E0"/>
             <w:tcBorders>
-              <w:top w:val="single" w:sz="4" w:space="0" w:color="AAAAAA"/>
-              <w:left w:val="single" w:sz="4" w:space="0" w:color="AAAAAA"/>
-              <w:bottom w:val="single" w:sz="4" w:space="0" w:color="AAAAAA"/>
-              <w:right w:val="single" w:sz="4" w:space="0" w:color="AAAAAA"/>
+              <w:top w:val="single" w:sz="4" w:space="0" w:color="CCCCCC"/>
+              <w:left w:val="single" w:sz="4" w:space="0" w:color="CCCCCC"/>
+              <w:bottom w:val="single" w:sz="4" w:space="0" w:color="CCCCCC"/>
+              <w:right w:val="single" w:sz="4" w:space="0" w:color="CCCCCC"/>
             </w:tcBorders>
           </w:tcPr>
           <w:p>
+            <w:pPr>
+              <w:spacing w:before="60" w:after="60"/>
+              <w:jc w:val="center"/>
+            </w:pPr>
             <w:r>
               <w:rPr>
                 <w:rFonts w:ascii="Arial" w:hAnsi="Arial"/>
@@ -888,26 +1024,83 @@
               <w:t>IMAGE 1 — SITE LOCATION</w:t>
             </w:r>
           </w:p>
-          <w:p/>
-          <w:p/>
-          <w:p/>
-          <w:p/>
-          <w:p/>
-          <w:p/>
-          <w:p/>
-          <w:p/>
+          <w:p>
+            <w:pPr>
+              <w:spacing w:before="0" w:after="0"/>
+            </w:pPr>
+          </w:p>
+          <w:p>
+            <w:pPr>
+              <w:spacing w:before="0" w:after="0"/>
+            </w:pPr>
+          </w:p>
+          <w:p>
+            <w:pPr>
+              <w:spacing w:before="0" w:after="0"/>
+            </w:pPr>
+          </w:p>
+          <w:p>
+            <w:pPr>
+              <w:spacing w:before="0" w:after="0"/>
+            </w:pPr>
+          </w:p>
+          <w:p>
+            <w:pPr>
+              <w:spacing w:before="0" w:after="0"/>
+            </w:pPr>
+          </w:p>
+          <w:p>
+            <w:pPr>
+              <w:spacing w:before="0" w:after="0"/>
+            </w:pPr>
+          </w:p>
+          <w:p>
+            <w:pPr>
+              <w:spacing w:before="0" w:after="0"/>
+            </w:pPr>
+          </w:p>
+          <w:p>
+            <w:pPr>
+              <w:spacing w:before="0" w:after="0"/>
+            </w:pPr>
+          </w:p>
+          <w:p>
+            <w:pPr>
+              <w:spacing w:before="0" w:after="0"/>
+            </w:pPr>
+          </w:p>
+          <w:p>
+            <w:pPr>
+              <w:spacing w:before="0" w:after="0"/>
+            </w:pPr>
+          </w:p>
+          <w:p>
+            <w:pPr>
+              <w:spacing w:before="0" w:after="0"/>
+            </w:pPr>
+          </w:p>
+          <w:p>
+            <w:pPr>
+              <w:spacing w:before="0" w:after="0"/>
+            </w:pPr>
+          </w:p>
         </w:tc>
         <w:tc>
           <w:tcPr>
             <w:tcW w:type="dxa" w:w="4819"/>
+            <w:shd w:val="clear" w:color="auto" w:fill="E0E0E0"/>
             <w:tcBorders>
-              <w:top w:val="single" w:sz="4" w:space="0" w:color="AAAAAA"/>
-              <w:left w:val="single" w:sz="4" w:space="0" w:color="AAAAAA"/>
-              <w:bottom w:val="single" w:sz="4" w:space="0" w:color="AAAAAA"/>
-              <w:right w:val="single" w:sz="4" w:space="0" w:color="AAAAAA"/>
+              <w:top w:val="single" w:sz="4" w:space="0" w:color="CCCCCC"/>
+              <w:left w:val="single" w:sz="4" w:space="0" w:color="CCCCCC"/>
+              <w:bottom w:val="single" w:sz="4" w:space="0" w:color="CCCCCC"/>
+              <w:right w:val="single" w:sz="4" w:space="0" w:color="CCCCCC"/>
             </w:tcBorders>
           </w:tcPr>
           <w:p>
+            <w:pPr>
+              <w:spacing w:before="60" w:after="60"/>
+              <w:jc w:val="center"/>
+            </w:pPr>
             <w:r>
               <w:rPr>
                 <w:rFonts w:ascii="Arial" w:hAnsi="Arial"/>
@@ -917,14 +1110,66 @@
               <w:t>IMAGE 2 — DIVERSION DRAWING</w:t>
             </w:r>
           </w:p>
-          <w:p/>
-          <w:p/>
-          <w:p/>
-          <w:p/>
-          <w:p/>
-          <w:p/>
-          <w:p/>
-          <w:p/>
+          <w:p>
+            <w:pPr>
+              <w:spacing w:before="0" w:after="0"/>
+            </w:pPr>
+          </w:p>
+          <w:p>
+            <w:pPr>
+              <w:spacing w:before="0" w:after="0"/>
+            </w:pPr>
+          </w:p>
+          <w:p>
+            <w:pPr>
+              <w:spacing w:before="0" w:after="0"/>
+            </w:pPr>
+          </w:p>
+          <w:p>
+            <w:pPr>
+              <w:spacing w:before="0" w:after="0"/>
+            </w:pPr>
+          </w:p>
+          <w:p>
+            <w:pPr>
+              <w:spacing w:before="0" w:after="0"/>
+            </w:pPr>
+          </w:p>
+          <w:p>
+            <w:pPr>
+              <w:spacing w:before="0" w:after="0"/>
+            </w:pPr>
+          </w:p>
+          <w:p>
+            <w:pPr>
+              <w:spacing w:before="0" w:after="0"/>
+            </w:pPr>
+          </w:p>
+          <w:p>
+            <w:pPr>
+              <w:spacing w:before="0" w:after="0"/>
+            </w:pPr>
+          </w:p>
+          <w:p>
+            <w:pPr>
+              <w:spacing w:before="0" w:after="0"/>
+            </w:pPr>
+          </w:p>
+          <w:p>
+            <w:pPr>
+              <w:spacing w:before="0" w:after="0"/>
+            </w:pPr>
+          </w:p>
+          <w:p>
+            <w:pPr>
+              <w:spacing w:before="0" w:after="0"/>
+            </w:pPr>
+          </w:p>
+          <w:p>
+            <w:pPr>
+              <w:spacing w:before="0" w:after="0"/>
+            </w:pPr>
+          </w:p>
         </w:tc>
       </w:tr>
       <w:tr>
@@ -933,23 +1178,23 @@
             <w:tcW w:type="dxa" w:w="9638"/>
             <w:gridSpan w:val="2"/>
             <w:tcBorders>
-              <w:top w:val="single" w:sz="4" w:space="0" w:color="AAAAAA"/>
-              <w:left w:val="single" w:sz="4" w:space="0" w:color="AAAAAA"/>
-              <w:bottom w:val="single" w:sz="4" w:space="0" w:color="AAAAAA"/>
-              <w:right w:val="single" w:sz="4" w:space="0" w:color="AAAAAA"/>
+              <w:top w:val="single" w:sz="4" w:space="0" w:color="CCCCCC"/>
+              <w:left w:val="single" w:sz="4" w:space="0" w:color="CCCCCC"/>
+              <w:bottom w:val="single" w:sz="4" w:space="0" w:color="CCCCCC"/>
+              <w:right w:val="single" w:sz="4" w:space="0" w:color="CCCCCC"/>
             </w:tcBorders>
-            <w:tcBorders>
-              <w:top w:val="single" w:sz="4" w:space="0" w:color="AAAAAA"/>
-              <w:left w:val="single" w:sz="4" w:space="0" w:color="AAAAAA"/>
-              <w:bottom w:val="single" w:sz="4" w:space="0" w:color="AAAAAA"/>
-              <w:right w:val="single" w:sz="4" w:space="0" w:color="AAAAAA"/>
-            </w:tcBorders>
+            <w:shd w:val="clear" w:color="auto" w:fill="F9F9F9"/>
           </w:tcPr>
           <w:p>
+            <w:pPr>
+              <w:spacing w:before="60" w:after="60"/>
+            </w:pPr>
             <w:r>
               <w:rPr>
                 <w:rFonts w:ascii="Arial" w:hAnsi="Arial"/>
-                <w:sz w:val="16"/>
+                <w:i/>
+                <w:color w:val="555555"/>
+                <w:sz w:val="17"/>
               </w:rPr>
               <w:t>See attached drawings / site photographs as applicable.</w:t>
             </w:r>
@@ -957,16 +1202,18 @@
         </w:tc>
       </w:tr>
     </w:tbl>
-    <w:p/>
     <w:p>
       <w:pPr>
-        <w:spacing w:after="60"/>
+        <w:spacing w:before="200" w:after="80"/>
+        <w:pBdr>
+          <w:bottom w:val="single" w:sz="12" w:space="1" w:color="1f4e79"/>
+        </w:pBdr>
       </w:pPr>
       <w:r>
         <w:rPr>
           <w:rFonts w:ascii="Arial" w:hAnsi="Arial"/>
           <w:b/>
-          <w:color w:val="1A4F8E"/>
+          <w:color w:val="1F4E79"/>
           <w:sz w:val="20"/>
         </w:rPr>
         <w:t>4. Sign-Off</w:t>
@@ -985,15 +1232,19 @@
       <w:tr>
         <w:tc>
           <w:tcPr>
-            <w:tcW w:type="dxa" w:w="4819"/>
+            <w:tcW w:type="dxa" w:w="3288"/>
+            <w:shd w:val="clear" w:color="auto" w:fill="F5F5F5"/>
             <w:tcBorders>
-              <w:top w:val="single" w:sz="4" w:space="0" w:color="AAAAAA"/>
-              <w:left w:val="single" w:sz="4" w:space="0" w:color="AAAAAA"/>
-              <w:bottom w:val="single" w:sz="4" w:space="0" w:color="AAAAAA"/>
-              <w:right w:val="single" w:sz="4" w:space="0" w:color="AAAAAA"/>
+              <w:top w:val="single" w:sz="4" w:space="0" w:color="CCCCCC"/>
+              <w:left w:val="single" w:sz="4" w:space="0" w:color="CCCCCC"/>
+              <w:bottom w:val="single" w:sz="4" w:space="0" w:color="CCCCCC"/>
+              <w:right w:val="single" w:sz="4" w:space="0" w:color="CCCCCC"/>
             </w:tcBorders>
           </w:tcPr>
           <w:p>
+            <w:pPr>
+              <w:spacing w:before="60" w:after="60"/>
+            </w:pPr>
             <w:r>
               <w:rPr>
                 <w:rFonts w:ascii="Arial" w:hAnsi="Arial"/>
@@ -1006,15 +1257,18 @@
         </w:tc>
         <w:tc>
           <w:tcPr>
-            <w:tcW w:type="dxa" w:w="4819"/>
+            <w:tcW w:type="dxa" w:w="6350"/>
             <w:tcBorders>
-              <w:top w:val="single" w:sz="4" w:space="0" w:color="AAAAAA"/>
-              <w:left w:val="single" w:sz="4" w:space="0" w:color="AAAAAA"/>
-              <w:bottom w:val="single" w:sz="4" w:space="0" w:color="AAAAAA"/>
-              <w:right w:val="single" w:sz="4" w:space="0" w:color="AAAAAA"/>
+              <w:top w:val="single" w:sz="4" w:space="0" w:color="CCCCCC"/>
+              <w:left w:val="single" w:sz="4" w:space="0" w:color="CCCCCC"/>
+              <w:bottom w:val="single" w:sz="4" w:space="0" w:color="CCCCCC"/>
+              <w:right w:val="single" w:sz="4" w:space="0" w:color="CCCCCC"/>
             </w:tcBorders>
           </w:tcPr>
           <w:p>
+            <w:pPr>
+              <w:spacing w:before="60" w:after="60"/>
+            </w:pPr>
             <w:r>
               <w:rPr>
                 <w:rFonts w:ascii="Arial" w:hAnsi="Arial"/>
@@ -1028,15 +1282,19 @@
       <w:tr>
         <w:tc>
           <w:tcPr>
-            <w:tcW w:type="dxa" w:w="4819"/>
+            <w:tcW w:type="dxa" w:w="3288"/>
+            <w:shd w:val="clear" w:color="auto" w:fill="F5F5F5"/>
             <w:tcBorders>
-              <w:top w:val="single" w:sz="4" w:space="0" w:color="AAAAAA"/>
-              <w:left w:val="single" w:sz="4" w:space="0" w:color="AAAAAA"/>
-              <w:bottom w:val="single" w:sz="4" w:space="0" w:color="AAAAAA"/>
-              <w:right w:val="single" w:sz="4" w:space="0" w:color="AAAAAA"/>
+              <w:top w:val="single" w:sz="4" w:space="0" w:color="CCCCCC"/>
+              <w:left w:val="single" w:sz="4" w:space="0" w:color="CCCCCC"/>
+              <w:bottom w:val="single" w:sz="4" w:space="0" w:color="CCCCCC"/>
+              <w:right w:val="single" w:sz="4" w:space="0" w:color="CCCCCC"/>
             </w:tcBorders>
           </w:tcPr>
           <w:p>
+            <w:pPr>
+              <w:spacing w:before="60" w:after="60"/>
+            </w:pPr>
             <w:r>
               <w:rPr>
                 <w:rFonts w:ascii="Arial" w:hAnsi="Arial"/>
@@ -1049,15 +1307,18 @@
         </w:tc>
         <w:tc>
           <w:tcPr>
-            <w:tcW w:type="dxa" w:w="4819"/>
+            <w:tcW w:type="dxa" w:w="6350"/>
             <w:tcBorders>
-              <w:top w:val="single" w:sz="4" w:space="0" w:color="AAAAAA"/>
-              <w:left w:val="single" w:sz="4" w:space="0" w:color="AAAAAA"/>
-              <w:bottom w:val="single" w:sz="4" w:space="0" w:color="AAAAAA"/>
-              <w:right w:val="single" w:sz="4" w:space="0" w:color="AAAAAA"/>
+              <w:top w:val="single" w:sz="4" w:space="0" w:color="CCCCCC"/>
+              <w:left w:val="single" w:sz="4" w:space="0" w:color="CCCCCC"/>
+              <w:bottom w:val="single" w:sz="4" w:space="0" w:color="CCCCCC"/>
+              <w:right w:val="single" w:sz="4" w:space="0" w:color="CCCCCC"/>
             </w:tcBorders>
           </w:tcPr>
           <w:p>
+            <w:pPr>
+              <w:spacing w:before="60" w:after="60"/>
+            </w:pPr>
             <w:r>
               <w:rPr>
                 <w:rFonts w:ascii="Arial" w:hAnsi="Arial"/>
@@ -1069,57 +1330,87 @@
         </w:tc>
       </w:tr>
     </w:tbl>
-    <w:p/>
     <w:p>
       <w:pPr>
-        <w:spacing w:before="80"/>
+        <w:spacing w:before="0" w:after="80"/>
       </w:pPr>
-      <w:r>
-        <w:rPr>
-          <w:rFonts w:ascii="Arial" w:hAnsi="Arial"/>
-          <w:b/>
-          <w:sz w:val="18"/>
-        </w:rPr>
-        <w:t>Notes</w:t>
-        <w:br/>
-      </w:r>
     </w:p>
-    <w:p>
-      <w:pPr>
-        <w:spacing w:before="20" w:after="20"/>
-      </w:pPr>
-      <w:r>
-        <w:rPr>
-          <w:rFonts w:ascii="Arial" w:hAnsi="Arial"/>
-          <w:sz w:val="18"/>
-        </w:rPr>
-        <w:t>• Official diversion plan to be passed to Network team once produced.</w:t>
-      </w:r>
-    </w:p>
-    <w:p>
-      <w:pPr>
-        <w:spacing w:before="20" w:after="20"/>
-      </w:pPr>
-      <w:r>
-        <w:rPr>
-          <w:rFonts w:ascii="Arial" w:hAnsi="Arial"/>
-          <w:sz w:val="18"/>
-        </w:rPr>
-        <w:t>• Emergency service vehicular access will be maintained throughout.</w:t>
-      </w:r>
-    </w:p>
-    <w:p>
-      <w:pPr>
-        <w:spacing w:before="20" w:after="20"/>
-      </w:pPr>
-      <w:r>
-        <w:rPr>
-          <w:rFonts w:ascii="Arial" w:hAnsi="Arial"/>
-          <w:sz w:val="18"/>
-        </w:rPr>
-        <w:t>• Residents and businesses notified via the separate Residents &amp; Businesses Letter.</w:t>
-      </w:r>
-    </w:p>
+    <w:tbl>
+      <w:tblPr>
+        <w:tblW w:type="auto" w:w="0"/>
+        <w:tblLook w:firstColumn="1" w:firstRow="1" w:lastColumn="0" w:lastRow="0" w:noHBand="0" w:noVBand="1" w:val="04A0"/>
+      </w:tblPr>
+      <w:tblGrid>
+        <w:gridCol w:w="9638"/>
+      </w:tblGrid>
+      <w:tr>
+        <w:tc>
+          <w:tcPr>
+            <w:tcW w:type="dxa" w:w="9638"/>
+            <w:shd w:val="clear" w:color="auto" w:fill="F9F9F9"/>
+            <w:tcBorders>
+              <w:top w:val="single" w:sz="4" w:space="0" w:color="DDDDDD"/>
+              <w:left w:val="single" w:sz="4" w:space="0" w:color="DDDDDD"/>
+              <w:bottom w:val="single" w:sz="4" w:space="0" w:color="DDDDDD"/>
+              <w:right w:val="single" w:sz="4" w:space="0" w:color="DDDDDD"/>
+            </w:tcBorders>
+          </w:tcPr>
+          <w:p>
+            <w:pPr>
+              <w:spacing w:before="80" w:after="80"/>
+            </w:pPr>
+            <w:r>
+              <w:rPr>
+                <w:rFonts w:ascii="Arial" w:hAnsi="Arial"/>
+                <w:b/>
+                <w:color w:val="333333"/>
+                <w:sz w:val="18"/>
+              </w:rPr>
+              <w:t>Notes</w:t>
+            </w:r>
+          </w:p>
+          <w:p>
+            <w:pPr>
+              <w:spacing w:before="20" w:after="40"/>
+            </w:pPr>
+            <w:r>
+              <w:rPr>
+                <w:rFonts w:ascii="Arial" w:hAnsi="Arial"/>
+                <w:color w:val="555555"/>
+                <w:sz w:val="18"/>
+              </w:rPr>
+              <w:t>• Official diversion plan to be passed to Network team once produced.</w:t>
+            </w:r>
+          </w:p>
+          <w:p>
+            <w:pPr>
+              <w:spacing w:before="20" w:after="40"/>
+            </w:pPr>
+            <w:r>
+              <w:rPr>
+                <w:rFonts w:ascii="Arial" w:hAnsi="Arial"/>
+                <w:color w:val="555555"/>
+                <w:sz w:val="18"/>
+              </w:rPr>
+              <w:t>• Emergency service vehicular access will be maintained throughout.</w:t>
+            </w:r>
+          </w:p>
+          <w:p>
+            <w:pPr>
+              <w:spacing w:before="20" w:after="40"/>
+            </w:pPr>
+            <w:r>
+              <w:rPr>
+                <w:rFonts w:ascii="Arial" w:hAnsi="Arial"/>
+                <w:color w:val="555555"/>
+                <w:sz w:val="18"/>
+              </w:rPr>
+              <w:t>• Residents and businesses notified via the separate Residents &amp; Businesses Letter.</w:t>
+            </w:r>
+          </w:p>
+        </w:tc>
+      </w:tr>
+    </w:tbl>
     <w:sectPr>
       <w:pgSz w:w="11906" w:h="16838"/>
       <w:pgMar w:top="850" w:right="1134" w:bottom="850" w:left="1134" w:header="720" w:footer="720" w:gutter="0"/>

</xml_diff>

<commit_message>
RSR: add Diversion Route(s) field
- New tm_diversion scheme field: multi-line textarea in edit panel
- Shown in Section 2 table after Working Hours in HTML preview
- {{TM_DIVERSION}} placeholder injected into DOCX on download
- Supports multi-line e.g. "Diversion 1: ...\nDiversion 2: ..."

https://claude.ai/code/session_01Nc3L33RdvZTDhVy6BGkTVT
</commit_message>
<xml_diff>
--- a/templates/RSR_TEMPLATE.docx
+++ b/templates/RSR_TEMPLATE.docx
@@ -970,6 +970,56 @@
           </w:p>
         </w:tc>
       </w:tr>
+      <w:tr>
+        <w:tc>
+          <w:tcPr>
+            <w:tcW w:type="dxa" w:w="3288"/>
+            <w:shd w:val="clear" w:color="auto" w:fill="F5F5F5"/>
+            <w:tcBorders>
+              <w:top w:val="single" w:sz="4" w:space="0" w:color="CCCCCC"/>
+              <w:left w:val="single" w:sz="4" w:space="0" w:color="CCCCCC"/>
+              <w:bottom w:val="single" w:sz="4" w:space="0" w:color="CCCCCC"/>
+              <w:right w:val="single" w:sz="4" w:space="0" w:color="CCCCCC"/>
+            </w:tcBorders>
+          </w:tcPr>
+          <w:p>
+            <w:pPr>
+              <w:spacing w:before="60" w:after="60"/>
+            </w:pPr>
+            <w:r>
+              <w:rPr>
+                <w:rFonts w:ascii="Arial" w:hAnsi="Arial"/>
+                <w:b/>
+                <w:sz w:val="18"/>
+              </w:rPr>
+              <w:t>Diversion Route(s)</w:t>
+            </w:r>
+          </w:p>
+        </w:tc>
+        <w:tc>
+          <w:tcPr>
+            <w:tcW w:type="dxa" w:w="6350"/>
+            <w:tcBorders>
+              <w:top w:val="single" w:sz="4" w:space="0" w:color="CCCCCC"/>
+              <w:left w:val="single" w:sz="4" w:space="0" w:color="CCCCCC"/>
+              <w:bottom w:val="single" w:sz="4" w:space="0" w:color="CCCCCC"/>
+              <w:right w:val="single" w:sz="4" w:space="0" w:color="CCCCCC"/>
+            </w:tcBorders>
+          </w:tcPr>
+          <w:p>
+            <w:pPr>
+              <w:spacing w:before="60" w:after="60"/>
+            </w:pPr>
+            <w:r>
+              <w:rPr>
+                <w:rFonts w:ascii="Arial" w:hAnsi="Arial"/>
+                <w:sz w:val="18"/>
+              </w:rPr>
+              <w:t>{{TM_DIVERSION}}</w:t>
+            </w:r>
+          </w:p>
+        </w:tc>
+      </w:tr>
     </w:tbl>
     <w:p>
       <w:pPr>

</xml_diff>